<commit_message>
Clarify that the restraining order had nothing to do with the death
The draft let the reader infer that a judge kept the author at Fort
Dix so he could say goodbye to his mother. The lawsuit was about a
retaliatory transfer and never mentioned her; the timing was
coincidence. Says so plainly, names the case and filing date, and
retitles the piece around the coincidence rather than the mercy.

Co-Authored-By: Claude Opus 5 <noreply@anthropic.com>
Claude-Session: https://claude.ai/code/session_01Pk1A5UusdgnU9bEu3BZJo4
</commit_message>
<xml_diff>
--- a/content/substack/when-someone-dies-while-you-are-inside.docx
+++ b/content/substack/when-someone-dies-while-you-are-inside.docx
@@ -47,7 +47,7 @@
           <w:b/>
           <w:sz w:val="36"/>
         </w:rPr>
-        <w:t>A Federal Judge Kept Me at Fort Dix Long Enough to Say Goodbye to My Mother</w:t>
+        <w:t>A Lawsuit About Something Else Is Why I Got to Say Goodbye to My Mother</w:t>
       </w:r>
     </w:p>
     <w:p>
@@ -152,12 +152,26 @@
     </w:p>
     <w:p>
       <w:r>
-        <w:t>The Bureau started moving to transfer me in March. I litigated it, and a federal judge granted a temporary restraining order stopping the transfer.</w:t>
+        <w:t xml:space="preserve">The Bureau moved to transfer me in March. I sued — </w:t>
+      </w:r>
+      <w:r>
+        <w:rPr>
+          <w:i/>
+        </w:rPr>
+        <w:t>Khan v. Thompson</w:t>
+      </w:r>
+      <w:r>
+        <w:t>, filed in the District of New Jersey on March 12, 2025 — and a federal judge granted a temporary restraining order stopping it.</w:t>
       </w:r>
     </w:p>
     <w:p>
       <w:r>
-        <w:t>So when my mother died in April, I was still at the prison where I had lived for nearly ten years.</w:t>
+        <w:t>That case had nothing to do with my mother. Not one word of it. It was about a retaliatory transfer, and no lawyer stood in front of a judge and asked him to let a man say goodbye to his dying mother.</w:t>
+      </w:r>
+    </w:p>
+    <w:p>
+      <w:r>
+        <w:t>But the order held. So when she died in April, I was still at the prison where I had lived for nearly ten years.</w:t>
       </w:r>
     </w:p>
     <w:p>
@@ -172,7 +186,7 @@
     </w:p>
     <w:p>
       <w:r>
-        <w:t>A judge gave me that. Not the Bureau.</w:t>
+        <w:t>I got that week because an unrelated lawsuit happened to be pending. That is the entire reason. Luck, wearing a court order.</w:t>
       </w:r>
     </w:p>
     <w:p>
@@ -377,7 +391,7 @@
     </w:p>
     <w:p>
       <w:r>
-        <w:t>A federal judge is the reason I got to tell her goodbye. That should not be how this works.</w:t>
+        <w:t>The reason I got to tell her goodbye is that I had a lawsuit going about something else. That should not be how this works.</w:t>
       </w:r>
     </w:p>
     <w:p>

</xml_diff>

<commit_message>
Emphasize how unlikely a camp furlough is, and correct the notification path
Italicizes "maybe" so the sentence carries the author's actual
skepticism rather than reading as a real option.

Corrects the tip on reporting a death: every institution is supposed
to connect a caller with the chaplain, or the on-duty lieutenant when
no chaplain is available, and they usually deliver the news in person.
The mechanism exists and works -- it just never starts until someone
outside makes the call, which is what the warning now sets up.

Also notes the python-docx dependency in the delivery workflow, since
a recycled container loses it.

Co-Authored-By: Claude Opus 5 <noreply@anthropic.com>
Claude-Session: https://claude.ai/code/session_01Pk1A5UusdgnU9bEu3BZJo4
</commit_message>
<xml_diff>
--- a/content/substack/when-someone-dies-while-you-are-inside.docx
+++ b/content/substack/when-someone-dies-while-you-are-inside.docx
@@ -47,7 +47,7 @@
           <w:b/>
           <w:sz w:val="36"/>
         </w:rPr>
-        <w:t>A Lawsuit About Something Else Is Why I Got to Say Goodbye to My Mother</w:t>
+        <w:t>My Mother Died While I Was Locked Up and the Bureau of Prisons Never Noticed</w:t>
       </w:r>
     </w:p>
     <w:p>
@@ -56,7 +56,7 @@
           <w:i/>
           <w:sz w:val="24"/>
         </w:rPr>
-        <w:t>Then the Bureau transferred me anyway.</w:t>
+        <w:t>My brother told me she died over CorrLinks.</w:t>
       </w:r>
     </w:p>
     <w:p>
@@ -130,12 +130,27 @@
     </w:p>
     <w:p>
       <w:r>
-        <w:t>My father and my sister stayed at her side until the end. I was nine hundred miles of policy away, on a fifteen-minute call, in a room full of men pretending not to listen.</w:t>
+        <w:t>My father and my sister stayed at her side until the end.</w:t>
+      </w:r>
+    </w:p>
+    <w:p>
+      <w:r>
+        <w:t>I was in New Jersey. She was in Rhode Island. A few hours in a car — and it made no difference at all. Distance is not what separates you in here. I could have been next door and it would have been the same phone on the same wall, with the same fifteen minutes on it.</w:t>
       </w:r>
     </w:p>
     <w:p>
       <w:r>
         <w:t>That call is the last thing I have. I got it because I happened to still be at Fort Dix that week.</w:t>
+      </w:r>
+    </w:p>
+    <w:p>
+      <w:r>
+        <w:t>That was not a given. The Bureau had been trying to transfer me since March, and a court order stopped it — so when she died in April I was still at the prison where I had lived for nearly ten years. Two months later they moved me to Texas anyway.</w:t>
+      </w:r>
+    </w:p>
+    <w:p>
+      <w:r>
+        <w:t>None of that had anything to do with my mother. The transfer had its own reasons and its own calendar, and her dying never entered into it in either direction.</w:t>
       </w:r>
     </w:p>
     <w:p>
@@ -147,46 +162,22 @@
     </w:p>
     <w:p>
       <w:r>
-        <w:t>Here is why that was not a given.</w:t>
+        <w:t>Being here that week mattered more than it sounds like it should.</w:t>
       </w:r>
     </w:p>
     <w:p>
       <w:r>
-        <w:t xml:space="preserve">The Bureau moved to transfer me in March. I sued — </w:t>
-      </w:r>
-      <w:r>
-        <w:rPr>
-          <w:i/>
-        </w:rPr>
-        <w:t>Khan v. Thompson</w:t>
-      </w:r>
-      <w:r>
-        <w:t>, filed in the District of New Jersey on March 12, 2025 — and a federal judge granted a temporary restraining order stopping it.</w:t>
+        <w:t>Whatever anyone wants to say about convicted felons, after a decade you have friends — real ones. We have all been through hard shit, and it helps to be around men who know that without being told.</w:t>
       </w:r>
     </w:p>
     <w:p>
       <w:r>
-        <w:t>That case had nothing to do with my mother. Not one word of it. It was about a retaliatory transfer, and nobody stood in front of that judge and asked her to let a man say goodbye to his dying mother.</w:t>
+        <w:t>They carried me. If I had been three days into a new compound where nobody knew my name, I could have made the same phone call and I do not know how I would have handled what came after it.</w:t>
       </w:r>
     </w:p>
     <w:p>
       <w:r>
-        <w:t>But the order held. So when she died in April, I was still at the prison where I had lived for nearly ten years.</w:t>
-      </w:r>
-    </w:p>
-    <w:p>
-      <w:r>
-        <w:t>That matters more than it sounds like it should. Whatever anyone wants to say about convicted felons, after a decade you have friends here — real ones. We have all been through hard shit, and it helps having men around who know that without being told.</w:t>
-      </w:r>
-    </w:p>
-    <w:p>
-      <w:r>
-        <w:t>They carried me that week. If I had been three days into a new compound where nobody knew my name, I could have made the same phone call and I do not know how I would have handled what came after it.</w:t>
-      </w:r>
-    </w:p>
-    <w:p>
-      <w:r>
-        <w:t>I got that week because an unrelated lawsuit happened to be pending. That is the entire reason. Luck, wearing a court order.</w:t>
+        <w:t>I got that only because a piece of paper happened to be in place that month. Not because anyone decided I should have it.</w:t>
       </w:r>
     </w:p>
     <w:p>
@@ -198,12 +189,32 @@
     </w:p>
     <w:p>
       <w:r>
-        <w:t>In May they transferred me anyway.</w:t>
+        <w:t>Here is what I actually want people to understand, and it is the reason I am writing this at all.</w:t>
       </w:r>
     </w:p>
     <w:p>
       <w:r>
-        <w:t>The Bureau does not care if someone in your family is dying. They will move you across the country in the middle of it, and the paperwork will not have a line on it for your mother.</w:t>
+        <w:t>The Bureau of Prisons is a machine. It does not weigh a dying parent, a sick child, a marriage coming apart, or a man who is barely holding himself together. There is no place to enter that information and nothing that stops when you do.</w:t>
+      </w:r>
+    </w:p>
+    <w:p>
+      <w:r>
+        <w:t>Do not mistake that for neutrality. This agency is cruel in plenty of ways, and the bureaucracy is one of them. A process with no place to put your mother is not gentler than cruelty. It just spreads it out thin enough that no single person ever has to own it.</w:t>
+      </w:r>
+    </w:p>
+    <w:p>
+      <w:r>
+        <w:t>A man's mother can die on a Tuesday and his transfer can go through weeks later, and the two facts never meet on a single piece of paper.</w:t>
+      </w:r>
+    </w:p>
+    <w:p>
+      <w:r>
+        <w:t>Bad things happen to everybody, free or not. What is different in here is that you get no say in when they land, and no say in where you are standing when they do.</w:t>
+      </w:r>
+    </w:p>
+    <w:p>
+      <w:r>
+        <w:t>There is never a good time. There is only where the machine has you when it happens.</w:t>
       </w:r>
     </w:p>
     <w:p>
@@ -215,7 +226,12 @@
     </w:p>
     <w:p>
       <w:r>
-        <w:t>The unit manager offered to let me call home. That happened only after the court order — and that same unit manager had no objection to my being transferred. He is the one who effectuated the transfer that a court later reversed.</w:t>
+        <w:t>My unit manager offered to let me call home. That same unit manager had no objection to my being shipped across the country, and she was the one who processed it.</w:t>
+      </w:r>
+    </w:p>
+    <w:p>
+      <w:r>
+        <w:t>Both of those things were true about the same person in the same month, and neither one touched the other. That is not hypocrisy. That is two unrelated tickets in the same inbox.</w:t>
       </w:r>
     </w:p>
     <w:p>
@@ -225,7 +241,16 @@
     </w:p>
     <w:p>
       <w:r>
-        <w:t>The rule is simple: you are allowed to ask. Getting it approved is another thing entirely. Maybe at a camp. Not here.</w:t>
+        <w:t xml:space="preserve">The rule is simple: you are allowed to ask. Getting it approved is another thing entirely. </w:t>
+      </w:r>
+      <w:r>
+        <w:rPr>
+          <w:i/>
+        </w:rPr>
+        <w:t>Maybe</w:t>
+      </w:r>
+      <w:r>
+        <w:t xml:space="preserve"> at a camp. Not here.</w:t>
       </w:r>
     </w:p>
     <w:p>
@@ -322,7 +347,12 @@
         <w:t>Call the institution yourself when someone dies.</w:t>
       </w:r>
       <w:r>
-        <w:t xml:space="preserve"> Ask for the chaplain and tell them what happened. The chaplain will come and find him and tell him in person, and someone will be standing there when he hears it.</w:t>
+        <w:t xml:space="preserve"> Every BOP institution is supposed to put you through to the chaplain, or to the on-duty lieutenant if there is no chaplain available. Tell them what happened. They will usually go find him and tell him in the moment, face to face, with somebody standing there when he hears it.</w:t>
+      </w:r>
+    </w:p>
+    <w:p>
+      <w:r>
+        <w:t>That system works. It just does not start until the phone rings.</w:t>
       </w:r>
     </w:p>
     <w:p>
@@ -386,12 +416,27 @@
     </w:p>
     <w:p>
       <w:r>
-        <w:t>We had our issues, she and I. Plenty of them. And we still built something close through a phone that cut off every fifteen minutes and a visiting room with a guard in the corner.</w:t>
+        <w:t>We had our issues, she and I. Plenty of them. And we still built something close through a phone that cuts off every fifteen minutes, across every year of this.</w:t>
       </w:r>
     </w:p>
     <w:p>
       <w:r>
-        <w:t>The reason I got to tell her goodbye is that I had a lawsuit going about something else. That should not be how this works.</w:t>
+        <w:t>She came to see me a few times after she got sick. The last time I saw my mother's face was December of 2023. She died sixteen months later.</w:t>
+      </w:r>
+    </w:p>
+    <w:p>
+      <w:r>
+        <w:t>I did not know that December was the last one. Nobody ever knows that. Out there you just get more chances to be wrong about it.</w:t>
+      </w:r>
+    </w:p>
+    <w:p>
+      <w:r>
+        <w:t>The reason I got to tell her goodbye is that I had a lawsuit going about something else, and the machine happened to be stopped that month.</w:t>
+      </w:r>
+    </w:p>
+    <w:p>
+      <w:r>
+        <w:t>That should not be how this works.</w:t>
       </w:r>
     </w:p>
     <w:p>

</xml_diff>